<commit_message>
Make territory field free-form (was ZIP-only)
- Admin Edit Rep + Pending Invite Edit modals: relabel 'Territory ZIPs
  (comma)' -> 'Territory (comma-separated)' with placeholder 'Denver
  Metro, Boulder, Colorado Springs'
- AI Edge Function system prompt: 'Territory ZIPs' -> 'Territory'
- README.md + BUSINESS_RULES.md updated to describe free-form tags
- Regenerated docs/BUSINESS_RULES.docx + .html

Schema unchanged — profiles.territory was already text[], so existing
ZIP-only data still works; new entries can be anything.
</commit_message>
<xml_diff>
--- a/docs/BUSINESS_RULES.docx
+++ b/docs/BUSINESS_RULES.docx
@@ -2567,19 +2567,19 @@
         <w:t xml:space="preserve">territory</w:t>
       </w:r>
       <w:r>
-        <w:t xml:space="preserve"> text array (ZIP codes).</w:t>
-      </w:r>
-    </w:p>
-    <w:p>
-      <w:pPr>
-        <w:numPr>
-          <w:ilvl w:val="0"/>
-          <w:numId w:val="1"/>
-        </w:numPr>
-        <w:ind w:left="720"/>
-      </w:pPr>
-      <w:r>
-        <w:t xml:space="preserve">Incoming web leads should be matched to a rep by ZIP overlap.</w:t>
+        <w:t xml:space="preserve"> text array — free-form tags (e.g., "Denver Metro", "Boulder", "Colorado").</w:t>
+      </w:r>
+    </w:p>
+    <w:p>
+      <w:pPr>
+        <w:numPr>
+          <w:ilvl w:val="0"/>
+          <w:numId w:val="1"/>
+        </w:numPr>
+        <w:ind w:left="720"/>
+      </w:pPr>
+      <w:r>
+        <w:t xml:space="preserve">Incoming web leads should be matched to a rep by territory tag (or city/state on the lead).</w:t>
       </w:r>
     </w:p>
     <w:p/>

</xml_diff>

<commit_message>
Lock CSV exports to admin-only + log every export attempt
- New SECURITY DEFINER function public.log_export(table, count, filter)
  in supabase/export-logging.sql. Authenticated users can call it; it
  inserts into audit_log with action='export'. Captures blocked rep
  attempts too.
- index.html: Reports tab Export CSV + Auto-monthly-with-commission
  buttons + Forecast Export CSV button now have admin-only class
  (auto-hidden for reps via the existing .admin-only toggle in boot()).
- app.js: reports.exportCsv() and forecasts.exportCsv() now defensively
  check auth.isAdmin() first — if rep, show toast and log the blocked
  attempt. Successful admin exports also call log_export.
- BUSINESS_RULES.md: documented the export policy + logging behavior.
- Regenerated docs/BUSINESS_RULES.docx + .html.
</commit_message>
<xml_diff>
--- a/docs/BUSINESS_RULES.docx
+++ b/docs/BUSINESS_RULES.docx
@@ -2501,6 +2501,24 @@
         <w:ind w:left="720"/>
       </w:pPr>
       <w:r>
+        <w:rPr>
+          <w:b/>
+        </w:rPr>
+        <w:t xml:space="preserve">Exports are admin-only.</w:t>
+      </w:r>
+      <w:r>
+        <w:t xml:space="preserve"> Reps see all data on screen but cannot click Export CSV — the button is hidden for the rep role. The exportCsv functions also defensively block non-admins server-side.</w:t>
+      </w:r>
+    </w:p>
+    <w:p>
+      <w:pPr>
+        <w:numPr>
+          <w:ilvl w:val="0"/>
+          <w:numId w:val="1"/>
+        </w:numPr>
+        <w:ind w:left="720"/>
+      </w:pPr>
+      <w:r>
         <w:t xml:space="preserve">Reports and Forecast CSV exports are </w:t>
       </w:r>
       <w:r>
@@ -2523,6 +2541,44 @@
       </w:pPr>
       <w:r>
         <w:t xml:space="preserve">A "Confidential — for the named exporter only. Do not redistribute." line is prepended to every export.</w:t>
+      </w:r>
+    </w:p>
+    <w:p>
+      <w:pPr>
+        <w:numPr>
+          <w:ilvl w:val="0"/>
+          <w:numId w:val="1"/>
+        </w:numPr>
+        <w:ind w:left="720"/>
+      </w:pPr>
+      <w:r>
+        <w:rPr>
+          <w:b/>
+        </w:rPr>
+        <w:t xml:space="preserve">Every export is logged to `audit_log`</w:t>
+      </w:r>
+      <w:r>
+        <w:t xml:space="preserve"> via </w:t>
+      </w:r>
+      <w:r>
+        <w:rPr>
+          <w:rFonts w:ascii="Menlo" w:hAnsi="Menlo"/>
+          <w:shd w:val="clear" w:color="auto" w:fill="EEEEEE"/>
+        </w:rPr>
+        <w:t xml:space="preserve">public.log_export()</w:t>
+      </w:r>
+      <w:r>
+        <w:t xml:space="preserve"> (record count, filter, timestamp, who). Blocked rep attempts are also logged as </w:t>
+      </w:r>
+      <w:r>
+        <w:rPr>
+          <w:rFonts w:ascii="Menlo" w:hAnsi="Menlo"/>
+          <w:shd w:val="clear" w:color="auto" w:fill="EEEEEE"/>
+        </w:rPr>
+        <w:t xml:space="preserve">BLOCKED — rep attempted</w:t>
+      </w:r>
+      <w:r>
+        <w:t xml:space="preserve">.</w:t>
       </w:r>
     </w:p>
     <w:p/>

</xml_diff>